<commit_message>
Update team bios and Yankey headshot
</commit_message>
<xml_diff>
--- a/Team Bios.docx
+++ b/Team Bios.docx
@@ -123,7 +123,43 @@
           <w:sz w:val="20"/>
           <w:szCs w:val="20"/>
         </w:rPr>
-        <w:t>medical degree at the Univeristy of Ghana Medical School. Bernice is currently a houseofficer at the Korle Bu Teaching Hospital and is pursuing a career in neurosurgery.</w:t>
+        <w:t xml:space="preserve">medical degree at the Univeristy of Ghana Medical School. Bernice is currently a houseofficer at the Korle Bu Teaching Hospital and </w:t>
+      </w:r>
+      <w:r>
+        <w:rPr>
+          <w:rFonts w:ascii="Times New Roman" w:hAnsi="Times New Roman" w:cs="Times New Roman"/>
+          <w:noProof/>
+          <w:sz w:val="20"/>
+          <w:szCs w:val="20"/>
+        </w:rPr>
+        <w:t xml:space="preserve">seeks to </w:t>
+      </w:r>
+      <w:r>
+        <w:rPr>
+          <w:rFonts w:ascii="Times New Roman" w:hAnsi="Times New Roman" w:cs="Times New Roman"/>
+          <w:noProof/>
+          <w:sz w:val="20"/>
+          <w:szCs w:val="20"/>
+        </w:rPr>
+        <w:t>pursu</w:t>
+      </w:r>
+      <w:r>
+        <w:rPr>
+          <w:rFonts w:ascii="Times New Roman" w:hAnsi="Times New Roman" w:cs="Times New Roman"/>
+          <w:noProof/>
+          <w:sz w:val="20"/>
+          <w:szCs w:val="20"/>
+        </w:rPr>
+        <w:t>e</w:t>
+      </w:r>
+      <w:r>
+        <w:rPr>
+          <w:rFonts w:ascii="Times New Roman" w:hAnsi="Times New Roman" w:cs="Times New Roman"/>
+          <w:noProof/>
+          <w:sz w:val="20"/>
+          <w:szCs w:val="20"/>
+        </w:rPr>
+        <w:t xml:space="preserve"> a career in neurosurgery.</w:t>
       </w:r>
     </w:p>
     <w:p>
@@ -180,16 +216,376 @@
           <w:sz w:val="20"/>
           <w:szCs w:val="20"/>
         </w:rPr>
-        <w:t xml:space="preserve">Lois is a final-year medical student at the University of Ghana Medical School with a strong interest in neurosurgery. She is deeply engaged in neuroscience and research, and aspires to build a rewarding career in academic </w:t>
-      </w:r>
-      <w:r>
-        <w:rPr>
-          <w:rFonts w:ascii="Times New Roman" w:hAnsi="Times New Roman" w:cs="Times New Roman"/>
-          <w:noProof/>
-          <w:sz w:val="20"/>
-          <w:szCs w:val="20"/>
-        </w:rPr>
-        <w:t>surgery</w:t>
+        <w:t>Lois is a fifth-year medical student at the University of Ghana Medical School and Co-Chair of the Ghana Neuroscience Network, where she coordinates neuroscience research initiatives and collaborates with multidisciplinary teams. She has a strong interest in neurosurgery and is actively involved in research and academic activities within the field.</w:t>
+      </w:r>
+    </w:p>
+    <w:p>
+      <w:pPr>
+        <w:spacing w:after="0" w:line="276" w:lineRule="auto"/>
+        <w:ind w:right="-761"/>
+        <w:jc w:val="both"/>
+        <w:rPr>
+          <w:rFonts w:ascii="Times New Roman" w:hAnsi="Times New Roman" w:cs="Times New Roman"/>
+          <w:noProof/>
+          <w:sz w:val="20"/>
+          <w:szCs w:val="20"/>
+        </w:rPr>
+      </w:pPr>
+    </w:p>
+    <w:p>
+      <w:pPr>
+        <w:spacing w:after="0" w:line="276" w:lineRule="auto"/>
+        <w:ind w:right="-761"/>
+        <w:jc w:val="both"/>
+        <w:rPr>
+          <w:rFonts w:ascii="Times New Roman" w:hAnsi="Times New Roman" w:cs="Times New Roman"/>
+          <w:noProof/>
+          <w:sz w:val="20"/>
+          <w:szCs w:val="20"/>
+        </w:rPr>
+      </w:pPr>
+      <w:r>
+        <w:rPr>
+          <w:rFonts w:ascii="Times New Roman" w:hAnsi="Times New Roman" w:cs="Times New Roman"/>
+          <w:noProof/>
+          <w:sz w:val="20"/>
+          <w:szCs w:val="20"/>
+        </w:rPr>
+        <w:t>Kwadwo Darko</w:t>
+      </w:r>
+      <w:r>
+        <w:rPr>
+          <w:rFonts w:ascii="Times New Roman" w:hAnsi="Times New Roman" w:cs="Times New Roman"/>
+          <w:noProof/>
+          <w:sz w:val="20"/>
+          <w:szCs w:val="20"/>
+        </w:rPr>
+        <w:t xml:space="preserve"> </w:t>
+      </w:r>
+      <w:r>
+        <w:rPr>
+          <w:rFonts w:ascii="Times New Roman" w:hAnsi="Times New Roman" w:cs="Times New Roman"/>
+          <w:noProof/>
+          <w:sz w:val="20"/>
+          <w:szCs w:val="20"/>
+        </w:rPr>
+        <w:t>– Founder and Education Co-Lead</w:t>
+      </w:r>
+    </w:p>
+    <w:p>
+      <w:pPr>
+        <w:spacing w:after="0" w:line="276" w:lineRule="auto"/>
+        <w:ind w:right="-761"/>
+        <w:jc w:val="both"/>
+        <w:rPr>
+          <w:rFonts w:ascii="Times New Roman" w:hAnsi="Times New Roman" w:cs="Times New Roman"/>
+          <w:noProof/>
+          <w:sz w:val="20"/>
+          <w:szCs w:val="20"/>
+        </w:rPr>
+      </w:pPr>
+      <w:r>
+        <w:rPr>
+          <w:rFonts w:ascii="Times New Roman" w:hAnsi="Times New Roman" w:cs="Times New Roman"/>
+          <w:noProof/>
+          <w:sz w:val="20"/>
+          <w:szCs w:val="20"/>
+        </w:rPr>
+        <w:t>Kwadwo</w:t>
+      </w:r>
+      <w:r>
+        <w:rPr>
+          <w:rFonts w:ascii="Times New Roman" w:hAnsi="Times New Roman" w:cs="Times New Roman"/>
+          <w:noProof/>
+          <w:sz w:val="20"/>
+          <w:szCs w:val="20"/>
+        </w:rPr>
+        <w:t xml:space="preserve"> earned his </w:t>
+      </w:r>
+      <w:r>
+        <w:rPr>
+          <w:rFonts w:ascii="Times New Roman" w:hAnsi="Times New Roman" w:cs="Times New Roman"/>
+          <w:noProof/>
+          <w:sz w:val="20"/>
+          <w:szCs w:val="20"/>
+        </w:rPr>
+        <w:t>medical degree at the Univeristy of Ghana Medical School.</w:t>
+      </w:r>
+    </w:p>
+    <w:p>
+      <w:pPr>
+        <w:spacing w:after="0" w:line="276" w:lineRule="auto"/>
+        <w:ind w:right="-761"/>
+        <w:jc w:val="both"/>
+        <w:rPr>
+          <w:rFonts w:ascii="Times New Roman" w:hAnsi="Times New Roman" w:cs="Times New Roman"/>
+          <w:noProof/>
+          <w:sz w:val="20"/>
+          <w:szCs w:val="20"/>
+        </w:rPr>
+      </w:pPr>
+    </w:p>
+    <w:p>
+      <w:pPr>
+        <w:spacing w:after="0" w:line="276" w:lineRule="auto"/>
+        <w:ind w:right="-761"/>
+        <w:jc w:val="both"/>
+        <w:rPr>
+          <w:rFonts w:ascii="Times New Roman" w:hAnsi="Times New Roman" w:cs="Times New Roman"/>
+          <w:noProof/>
+          <w:sz w:val="20"/>
+          <w:szCs w:val="20"/>
+        </w:rPr>
+      </w:pPr>
+      <w:r>
+        <w:rPr>
+          <w:rFonts w:ascii="Times New Roman" w:hAnsi="Times New Roman" w:cs="Times New Roman"/>
+          <w:noProof/>
+          <w:sz w:val="20"/>
+          <w:szCs w:val="20"/>
+        </w:rPr>
+        <w:t>Michael Yankey</w:t>
+      </w:r>
+      <w:r>
+        <w:rPr>
+          <w:rFonts w:ascii="Times New Roman" w:hAnsi="Times New Roman" w:cs="Times New Roman"/>
+          <w:noProof/>
+          <w:sz w:val="20"/>
+          <w:szCs w:val="20"/>
+        </w:rPr>
+        <w:t xml:space="preserve"> </w:t>
+      </w:r>
+      <w:r>
+        <w:rPr>
+          <w:rFonts w:ascii="Times New Roman" w:hAnsi="Times New Roman" w:cs="Times New Roman"/>
+          <w:noProof/>
+          <w:sz w:val="20"/>
+          <w:szCs w:val="20"/>
+        </w:rPr>
+        <w:t>– Statistics Lead</w:t>
+      </w:r>
+    </w:p>
+    <w:p>
+      <w:pPr>
+        <w:spacing w:after="0" w:line="276" w:lineRule="auto"/>
+        <w:ind w:right="-761"/>
+        <w:jc w:val="both"/>
+        <w:rPr>
+          <w:rFonts w:ascii="Times New Roman" w:hAnsi="Times New Roman" w:cs="Times New Roman"/>
+          <w:noProof/>
+          <w:sz w:val="20"/>
+          <w:szCs w:val="20"/>
+        </w:rPr>
+      </w:pPr>
+      <w:r>
+        <w:rPr>
+          <w:rFonts w:ascii="Times New Roman" w:hAnsi="Times New Roman" w:cs="Times New Roman"/>
+          <w:noProof/>
+          <w:sz w:val="20"/>
+          <w:szCs w:val="20"/>
+        </w:rPr>
+        <w:t xml:space="preserve">Michael obtained his medical degree from the University of Ghana Medical School </w:t>
+      </w:r>
+      <w:r>
+        <w:rPr>
+          <w:rFonts w:ascii="Times New Roman" w:hAnsi="Times New Roman" w:cs="Times New Roman"/>
+          <w:noProof/>
+          <w:sz w:val="20"/>
+          <w:szCs w:val="20"/>
+        </w:rPr>
+        <w:t>after</w:t>
+      </w:r>
+      <w:r>
+        <w:rPr>
+          <w:rFonts w:ascii="Times New Roman" w:hAnsi="Times New Roman" w:cs="Times New Roman"/>
+          <w:noProof/>
+          <w:sz w:val="20"/>
+          <w:szCs w:val="20"/>
+        </w:rPr>
+        <w:t xml:space="preserve"> previously complet</w:t>
+      </w:r>
+      <w:r>
+        <w:rPr>
+          <w:rFonts w:ascii="Times New Roman" w:hAnsi="Times New Roman" w:cs="Times New Roman"/>
+          <w:noProof/>
+          <w:sz w:val="20"/>
+          <w:szCs w:val="20"/>
+        </w:rPr>
+        <w:t>ing</w:t>
+      </w:r>
+      <w:r>
+        <w:rPr>
+          <w:rFonts w:ascii="Times New Roman" w:hAnsi="Times New Roman" w:cs="Times New Roman"/>
+          <w:noProof/>
+          <w:sz w:val="20"/>
+          <w:szCs w:val="20"/>
+        </w:rPr>
+        <w:t xml:space="preserve"> his undergraduate studies. </w:t>
+      </w:r>
+      <w:r>
+        <w:rPr>
+          <w:rFonts w:ascii="Times New Roman" w:hAnsi="Times New Roman" w:cs="Times New Roman"/>
+          <w:noProof/>
+          <w:sz w:val="20"/>
+          <w:szCs w:val="20"/>
+        </w:rPr>
+        <w:t>Michael is a masters student in biostatisitics and has interests in neurosurgery and neuropathology.</w:t>
+      </w:r>
+    </w:p>
+    <w:p>
+      <w:pPr>
+        <w:spacing w:after="0" w:line="276" w:lineRule="auto"/>
+        <w:ind w:right="-761"/>
+        <w:jc w:val="both"/>
+        <w:rPr>
+          <w:rFonts w:ascii="Times New Roman" w:hAnsi="Times New Roman" w:cs="Times New Roman"/>
+          <w:noProof/>
+          <w:sz w:val="20"/>
+          <w:szCs w:val="20"/>
+        </w:rPr>
+      </w:pPr>
+    </w:p>
+    <w:p>
+      <w:pPr>
+        <w:spacing w:after="0" w:line="276" w:lineRule="auto"/>
+        <w:ind w:right="-761"/>
+        <w:jc w:val="both"/>
+        <w:rPr>
+          <w:rFonts w:ascii="Times New Roman" w:hAnsi="Times New Roman" w:cs="Times New Roman"/>
+          <w:noProof/>
+          <w:sz w:val="20"/>
+          <w:szCs w:val="20"/>
+        </w:rPr>
+      </w:pPr>
+      <w:r>
+        <w:rPr>
+          <w:rFonts w:ascii="Times New Roman" w:hAnsi="Times New Roman" w:cs="Times New Roman"/>
+          <w:noProof/>
+          <w:sz w:val="20"/>
+          <w:szCs w:val="20"/>
+        </w:rPr>
+        <w:t>Princess Nkrumah-Boateng</w:t>
+      </w:r>
+      <w:r>
+        <w:rPr>
+          <w:rFonts w:ascii="Times New Roman" w:hAnsi="Times New Roman" w:cs="Times New Roman"/>
+          <w:noProof/>
+          <w:sz w:val="20"/>
+          <w:szCs w:val="20"/>
+        </w:rPr>
+        <w:t xml:space="preserve"> - </w:t>
+      </w:r>
+      <w:r>
+        <w:rPr>
+          <w:rFonts w:ascii="Times New Roman" w:hAnsi="Times New Roman" w:cs="Times New Roman"/>
+          <w:noProof/>
+          <w:sz w:val="20"/>
+          <w:szCs w:val="20"/>
+        </w:rPr>
+        <w:t xml:space="preserve">Statistics </w:t>
+      </w:r>
+      <w:r>
+        <w:rPr>
+          <w:rFonts w:ascii="Times New Roman" w:hAnsi="Times New Roman" w:cs="Times New Roman"/>
+          <w:noProof/>
+          <w:sz w:val="20"/>
+          <w:szCs w:val="20"/>
+        </w:rPr>
+        <w:t>Co-Lead</w:t>
+      </w:r>
+    </w:p>
+    <w:p>
+      <w:pPr>
+        <w:spacing w:after="0" w:line="276" w:lineRule="auto"/>
+        <w:ind w:right="-761"/>
+        <w:jc w:val="both"/>
+        <w:rPr>
+          <w:rFonts w:ascii="Times New Roman" w:hAnsi="Times New Roman" w:cs="Times New Roman"/>
+          <w:noProof/>
+          <w:sz w:val="20"/>
+          <w:szCs w:val="20"/>
+        </w:rPr>
+      </w:pPr>
+      <w:r>
+        <w:rPr>
+          <w:rFonts w:ascii="Times New Roman" w:hAnsi="Times New Roman" w:cs="Times New Roman"/>
+          <w:noProof/>
+          <w:sz w:val="20"/>
+          <w:szCs w:val="20"/>
+        </w:rPr>
+        <w:t xml:space="preserve">Princess Afia Nkrumah-Boateng is a fifth-year medical student at the </w:t>
+      </w:r>
+      <w:r>
+        <w:rPr>
+          <w:rFonts w:ascii="Times New Roman" w:hAnsi="Times New Roman" w:cs="Times New Roman"/>
+          <w:noProof/>
+          <w:sz w:val="20"/>
+          <w:szCs w:val="20"/>
+        </w:rPr>
+        <w:t>University of Ghana</w:t>
+      </w:r>
+      <w:r>
+        <w:rPr>
+          <w:rFonts w:ascii="Times New Roman" w:hAnsi="Times New Roman" w:cs="Times New Roman"/>
+          <w:noProof/>
+          <w:sz w:val="20"/>
+          <w:szCs w:val="20"/>
+        </w:rPr>
+        <w:t xml:space="preserve"> Medical School</w:t>
+      </w:r>
+      <w:r>
+        <w:rPr>
+          <w:rFonts w:ascii="Times New Roman" w:hAnsi="Times New Roman" w:cs="Times New Roman"/>
+          <w:noProof/>
+          <w:sz w:val="20"/>
+          <w:szCs w:val="20"/>
+        </w:rPr>
+        <w:t xml:space="preserve">. </w:t>
+      </w:r>
+      <w:r>
+        <w:rPr>
+          <w:rFonts w:ascii="Times New Roman" w:hAnsi="Times New Roman" w:cs="Times New Roman"/>
+          <w:noProof/>
+          <w:sz w:val="20"/>
+          <w:szCs w:val="20"/>
+        </w:rPr>
+        <w:t xml:space="preserve">She </w:t>
+      </w:r>
+      <w:r>
+        <w:rPr>
+          <w:rFonts w:ascii="Times New Roman" w:hAnsi="Times New Roman" w:cs="Times New Roman"/>
+          <w:noProof/>
+          <w:sz w:val="20"/>
+          <w:szCs w:val="20"/>
+        </w:rPr>
+        <w:t>has</w:t>
+      </w:r>
+      <w:r>
+        <w:rPr>
+          <w:rFonts w:ascii="Times New Roman" w:hAnsi="Times New Roman" w:cs="Times New Roman"/>
+          <w:noProof/>
+          <w:sz w:val="20"/>
+          <w:szCs w:val="20"/>
+        </w:rPr>
+        <w:t xml:space="preserve"> a profound passion for neuroscience</w:t>
+      </w:r>
+      <w:r>
+        <w:rPr>
+          <w:rFonts w:ascii="Times New Roman" w:hAnsi="Times New Roman" w:cs="Times New Roman"/>
+          <w:noProof/>
+          <w:sz w:val="20"/>
+          <w:szCs w:val="20"/>
+        </w:rPr>
+        <w:t xml:space="preserve"> and </w:t>
+      </w:r>
+      <w:r>
+        <w:rPr>
+          <w:rFonts w:ascii="Times New Roman" w:hAnsi="Times New Roman" w:cs="Times New Roman"/>
+          <w:noProof/>
+          <w:sz w:val="20"/>
+          <w:szCs w:val="20"/>
+        </w:rPr>
+        <w:t>leadership</w:t>
       </w:r>
       <w:r>
         <w:rPr>
@@ -233,7 +629,47 @@
           <w:sz w:val="20"/>
           <w:szCs w:val="20"/>
         </w:rPr>
-        <w:t>Kwadwo Darko</w:t>
+        <w:t>Mildred Obeyaa Marfo – Education Lead</w:t>
+      </w:r>
+    </w:p>
+    <w:p>
+      <w:pPr>
+        <w:spacing w:after="0" w:line="276" w:lineRule="auto"/>
+        <w:ind w:right="-761"/>
+        <w:jc w:val="both"/>
+        <w:rPr>
+          <w:rFonts w:ascii="Times New Roman" w:hAnsi="Times New Roman" w:cs="Times New Roman"/>
+          <w:noProof/>
+          <w:sz w:val="20"/>
+          <w:szCs w:val="20"/>
+        </w:rPr>
+      </w:pPr>
+      <w:r>
+        <w:rPr>
+          <w:rFonts w:ascii="Times New Roman" w:hAnsi="Times New Roman" w:cs="Times New Roman"/>
+          <w:noProof/>
+          <w:sz w:val="20"/>
+          <w:szCs w:val="20"/>
+        </w:rPr>
+        <w:t>Mildred</w:t>
+      </w:r>
+      <w:r>
+        <w:rPr>
+          <w:rFonts w:ascii="Times New Roman" w:hAnsi="Times New Roman" w:cs="Times New Roman"/>
+          <w:noProof/>
+          <w:sz w:val="20"/>
+          <w:szCs w:val="20"/>
+        </w:rPr>
+        <w:t xml:space="preserve"> earned </w:t>
+      </w:r>
+      <w:r>
+        <w:rPr>
+          <w:rFonts w:ascii="Times New Roman" w:hAnsi="Times New Roman" w:cs="Times New Roman"/>
+          <w:noProof/>
+          <w:sz w:val="20"/>
+          <w:szCs w:val="20"/>
+        </w:rPr>
+        <w:t>her</w:t>
       </w:r>
       <w:r>
         <w:rPr>
@@ -251,82 +687,109 @@
           <w:sz w:val="20"/>
           <w:szCs w:val="20"/>
         </w:rPr>
-        <w:t>– Founder and Education Co-Lead</w:t>
-      </w:r>
-    </w:p>
-    <w:p>
-      <w:pPr>
-        <w:spacing w:after="0" w:line="276" w:lineRule="auto"/>
-        <w:ind w:right="-761"/>
-        <w:jc w:val="both"/>
-        <w:rPr>
-          <w:rFonts w:ascii="Times New Roman" w:hAnsi="Times New Roman" w:cs="Times New Roman"/>
-          <w:noProof/>
-          <w:sz w:val="20"/>
-          <w:szCs w:val="20"/>
-        </w:rPr>
-      </w:pPr>
-      <w:r>
-        <w:rPr>
-          <w:rFonts w:ascii="Times New Roman" w:hAnsi="Times New Roman" w:cs="Times New Roman"/>
-          <w:noProof/>
-          <w:sz w:val="20"/>
-          <w:szCs w:val="20"/>
-        </w:rPr>
-        <w:t>Kwadwo</w:t>
-      </w:r>
-      <w:r>
-        <w:rPr>
-          <w:rFonts w:ascii="Times New Roman" w:hAnsi="Times New Roman" w:cs="Times New Roman"/>
-          <w:noProof/>
-          <w:sz w:val="20"/>
-          <w:szCs w:val="20"/>
-        </w:rPr>
-        <w:t xml:space="preserve"> earned his </w:t>
-      </w:r>
-      <w:r>
-        <w:rPr>
-          <w:rFonts w:ascii="Times New Roman" w:hAnsi="Times New Roman" w:cs="Times New Roman"/>
-          <w:noProof/>
-          <w:sz w:val="20"/>
-          <w:szCs w:val="20"/>
-        </w:rPr>
-        <w:t xml:space="preserve">medical degree at the Univeristy of Ghana Medical School. </w:t>
-      </w:r>
-    </w:p>
-    <w:p>
-      <w:pPr>
-        <w:spacing w:after="0" w:line="276" w:lineRule="auto"/>
-        <w:ind w:right="-761"/>
-        <w:jc w:val="both"/>
-        <w:rPr>
-          <w:rFonts w:ascii="Times New Roman" w:hAnsi="Times New Roman" w:cs="Times New Roman"/>
-          <w:noProof/>
-          <w:sz w:val="20"/>
-          <w:szCs w:val="20"/>
-        </w:rPr>
-      </w:pPr>
-    </w:p>
-    <w:p>
-      <w:pPr>
-        <w:spacing w:after="0" w:line="276" w:lineRule="auto"/>
-        <w:ind w:right="-761"/>
-        <w:jc w:val="both"/>
-        <w:rPr>
-          <w:rFonts w:ascii="Times New Roman" w:hAnsi="Times New Roman" w:cs="Times New Roman"/>
-          <w:noProof/>
-          <w:sz w:val="20"/>
-          <w:szCs w:val="20"/>
-        </w:rPr>
-      </w:pPr>
-      <w:r>
-        <w:rPr>
-          <w:rFonts w:ascii="Times New Roman" w:hAnsi="Times New Roman" w:cs="Times New Roman"/>
-          <w:noProof/>
-          <w:sz w:val="20"/>
-          <w:szCs w:val="20"/>
-        </w:rPr>
-        <w:t>Michael Yankey</w:t>
+        <w:t xml:space="preserve">medical degree at the University of Development Studies. </w:t>
+      </w:r>
+      <w:r>
+        <w:rPr>
+          <w:rFonts w:ascii="Times New Roman" w:hAnsi="Times New Roman" w:cs="Times New Roman"/>
+          <w:noProof/>
+          <w:sz w:val="20"/>
+          <w:szCs w:val="20"/>
+        </w:rPr>
+        <w:t xml:space="preserve">Mildred </w:t>
+      </w:r>
+      <w:r>
+        <w:rPr>
+          <w:rFonts w:ascii="Times New Roman" w:hAnsi="Times New Roman" w:cs="Times New Roman"/>
+          <w:noProof/>
+          <w:sz w:val="20"/>
+          <w:szCs w:val="20"/>
+        </w:rPr>
+        <w:t xml:space="preserve">is </w:t>
+      </w:r>
+      <w:r>
+        <w:rPr>
+          <w:rFonts w:ascii="Times New Roman" w:hAnsi="Times New Roman" w:cs="Times New Roman"/>
+          <w:noProof/>
+          <w:sz w:val="20"/>
+          <w:szCs w:val="20"/>
+        </w:rPr>
+        <w:t>currently a Senior House Officer at Achimota Hospital in Accra, Ghana. She has a growing interest in pediatric neurosurgery and hopes to pursue formal training in the field. Her clinical and research interests are broadly centered on neurosurgery, with a focus on improving care for children. She has been involved in research exploring neurosurgical care and outcomes in Ghana. Mildred is a member of the International Society for Pediatric Neurosurgery. She is also interested in global neurosurgery and advancing access to safe and timely neurosurgical care in Ghana. Through her work, she aims to contribute to strengthening neurosurgical systems and expanding care for children in underserved communities.</w:t>
+      </w:r>
+    </w:p>
+    <w:p>
+      <w:pPr>
+        <w:spacing w:after="0" w:line="276" w:lineRule="auto"/>
+        <w:ind w:right="-761"/>
+        <w:jc w:val="both"/>
+        <w:rPr>
+          <w:rFonts w:ascii="Times New Roman" w:hAnsi="Times New Roman" w:cs="Times New Roman"/>
+          <w:noProof/>
+          <w:sz w:val="20"/>
+          <w:szCs w:val="20"/>
+        </w:rPr>
+      </w:pPr>
+    </w:p>
+    <w:p>
+      <w:pPr>
+        <w:spacing w:after="0" w:line="276" w:lineRule="auto"/>
+        <w:ind w:right="-761"/>
+        <w:jc w:val="both"/>
+        <w:rPr>
+          <w:rFonts w:ascii="Times New Roman" w:hAnsi="Times New Roman" w:cs="Times New Roman"/>
+          <w:noProof/>
+          <w:sz w:val="20"/>
+          <w:szCs w:val="20"/>
+        </w:rPr>
+      </w:pPr>
+      <w:r>
+        <w:rPr>
+          <w:rFonts w:ascii="Times New Roman" w:hAnsi="Times New Roman" w:cs="Times New Roman"/>
+          <w:noProof/>
+          <w:sz w:val="20"/>
+          <w:szCs w:val="20"/>
+        </w:rPr>
+        <w:t>Maame Doudua – Research Lead</w:t>
+      </w:r>
+    </w:p>
+    <w:p>
+      <w:pPr>
+        <w:spacing w:after="0" w:line="276" w:lineRule="auto"/>
+        <w:ind w:right="-761"/>
+        <w:jc w:val="both"/>
+        <w:rPr>
+          <w:rFonts w:ascii="Times New Roman" w:hAnsi="Times New Roman" w:cs="Times New Roman"/>
+          <w:noProof/>
+          <w:sz w:val="20"/>
+          <w:szCs w:val="20"/>
+        </w:rPr>
+      </w:pPr>
+      <w:r>
+        <w:rPr>
+          <w:rFonts w:ascii="Times New Roman" w:hAnsi="Times New Roman" w:cs="Times New Roman"/>
+          <w:noProof/>
+          <w:sz w:val="20"/>
+          <w:szCs w:val="20"/>
+        </w:rPr>
+        <w:t>Maame</w:t>
+      </w:r>
+      <w:r>
+        <w:rPr>
+          <w:rFonts w:ascii="Times New Roman" w:hAnsi="Times New Roman" w:cs="Times New Roman"/>
+          <w:noProof/>
+          <w:sz w:val="20"/>
+          <w:szCs w:val="20"/>
+        </w:rPr>
+        <w:t xml:space="preserve"> earned </w:t>
+      </w:r>
+      <w:r>
+        <w:rPr>
+          <w:rFonts w:ascii="Times New Roman" w:hAnsi="Times New Roman" w:cs="Times New Roman"/>
+          <w:noProof/>
+          <w:sz w:val="20"/>
+          <w:szCs w:val="20"/>
+        </w:rPr>
+        <w:t>her</w:t>
       </w:r>
       <w:r>
         <w:rPr>
@@ -344,158 +807,109 @@
           <w:sz w:val="20"/>
           <w:szCs w:val="20"/>
         </w:rPr>
-        <w:t>– Statistics Lead</w:t>
-      </w:r>
-    </w:p>
-    <w:p>
-      <w:pPr>
-        <w:spacing w:after="0" w:line="276" w:lineRule="auto"/>
-        <w:ind w:right="-761"/>
-        <w:jc w:val="both"/>
-        <w:rPr>
-          <w:rFonts w:ascii="Times New Roman" w:hAnsi="Times New Roman" w:cs="Times New Roman"/>
-          <w:noProof/>
-          <w:sz w:val="20"/>
-          <w:szCs w:val="20"/>
-        </w:rPr>
-      </w:pPr>
-      <w:r>
-        <w:rPr>
-          <w:rFonts w:ascii="Times New Roman" w:hAnsi="Times New Roman" w:cs="Times New Roman"/>
-          <w:noProof/>
-          <w:sz w:val="20"/>
-          <w:szCs w:val="20"/>
-        </w:rPr>
-        <w:t xml:space="preserve">Michael obtained his medical degree from the University of Ghana Medical School </w:t>
-      </w:r>
-      <w:r>
-        <w:rPr>
-          <w:rFonts w:ascii="Times New Roman" w:hAnsi="Times New Roman" w:cs="Times New Roman"/>
-          <w:noProof/>
-          <w:sz w:val="20"/>
-          <w:szCs w:val="20"/>
-        </w:rPr>
-        <w:t>after</w:t>
-      </w:r>
-      <w:r>
-        <w:rPr>
-          <w:rFonts w:ascii="Times New Roman" w:hAnsi="Times New Roman" w:cs="Times New Roman"/>
-          <w:noProof/>
-          <w:sz w:val="20"/>
-          <w:szCs w:val="20"/>
-        </w:rPr>
-        <w:t xml:space="preserve"> previously complet</w:t>
-      </w:r>
-      <w:r>
-        <w:rPr>
-          <w:rFonts w:ascii="Times New Roman" w:hAnsi="Times New Roman" w:cs="Times New Roman"/>
-          <w:noProof/>
-          <w:sz w:val="20"/>
-          <w:szCs w:val="20"/>
-        </w:rPr>
-        <w:t>ing</w:t>
-      </w:r>
-      <w:r>
-        <w:rPr>
-          <w:rFonts w:ascii="Times New Roman" w:hAnsi="Times New Roman" w:cs="Times New Roman"/>
-          <w:noProof/>
-          <w:sz w:val="20"/>
-          <w:szCs w:val="20"/>
-        </w:rPr>
-        <w:t xml:space="preserve"> his undergraduate studies. He is currently practicing as a medical officer and intends to start his neurosurgery residency in 2026.</w:t>
-      </w:r>
-    </w:p>
-    <w:p>
-      <w:pPr>
-        <w:spacing w:after="0" w:line="276" w:lineRule="auto"/>
-        <w:ind w:right="-761"/>
-        <w:jc w:val="both"/>
-        <w:rPr>
-          <w:rFonts w:ascii="Times New Roman" w:hAnsi="Times New Roman" w:cs="Times New Roman"/>
-          <w:noProof/>
-          <w:sz w:val="20"/>
-          <w:szCs w:val="20"/>
-        </w:rPr>
-      </w:pPr>
-    </w:p>
-    <w:p>
-      <w:pPr>
-        <w:spacing w:after="0" w:line="276" w:lineRule="auto"/>
-        <w:ind w:right="-761"/>
-        <w:jc w:val="both"/>
-        <w:rPr>
-          <w:rFonts w:ascii="Times New Roman" w:hAnsi="Times New Roman" w:cs="Times New Roman"/>
-          <w:noProof/>
-          <w:sz w:val="20"/>
-          <w:szCs w:val="20"/>
-        </w:rPr>
-      </w:pPr>
-      <w:r>
-        <w:rPr>
-          <w:rFonts w:ascii="Times New Roman" w:hAnsi="Times New Roman" w:cs="Times New Roman"/>
-          <w:noProof/>
-          <w:sz w:val="20"/>
-          <w:szCs w:val="20"/>
-        </w:rPr>
-        <w:t>Princess Nkrumah-Boateng</w:t>
-      </w:r>
-      <w:r>
-        <w:rPr>
-          <w:rFonts w:ascii="Times New Roman" w:hAnsi="Times New Roman" w:cs="Times New Roman"/>
-          <w:noProof/>
-          <w:sz w:val="20"/>
-          <w:szCs w:val="20"/>
-        </w:rPr>
-        <w:t xml:space="preserve"> - </w:t>
-      </w:r>
-      <w:r>
-        <w:rPr>
-          <w:rFonts w:ascii="Times New Roman" w:hAnsi="Times New Roman" w:cs="Times New Roman"/>
-          <w:noProof/>
-          <w:sz w:val="20"/>
-          <w:szCs w:val="20"/>
-        </w:rPr>
-        <w:t xml:space="preserve">Statistics </w:t>
-      </w:r>
-      <w:r>
-        <w:rPr>
-          <w:rFonts w:ascii="Times New Roman" w:hAnsi="Times New Roman" w:cs="Times New Roman"/>
-          <w:noProof/>
-          <w:sz w:val="20"/>
-          <w:szCs w:val="20"/>
-        </w:rPr>
-        <w:t>Co-Lead</w:t>
-      </w:r>
-    </w:p>
-    <w:p>
-      <w:pPr>
-        <w:spacing w:after="0" w:line="276" w:lineRule="auto"/>
-        <w:ind w:right="-761"/>
-        <w:jc w:val="both"/>
-        <w:rPr>
-          <w:rFonts w:ascii="Times New Roman" w:hAnsi="Times New Roman" w:cs="Times New Roman"/>
-          <w:noProof/>
-          <w:sz w:val="20"/>
-          <w:szCs w:val="20"/>
-        </w:rPr>
-      </w:pPr>
-      <w:r>
-        <w:rPr>
-          <w:rFonts w:ascii="Times New Roman" w:hAnsi="Times New Roman" w:cs="Times New Roman"/>
-          <w:noProof/>
-          <w:sz w:val="20"/>
-          <w:szCs w:val="20"/>
-        </w:rPr>
-        <w:t xml:space="preserve">Princess Afia Nkrumah-Boateng is a fifth-year medical student at the </w:t>
-      </w:r>
-      <w:r>
-        <w:rPr>
-          <w:rFonts w:ascii="Times New Roman" w:hAnsi="Times New Roman" w:cs="Times New Roman"/>
-          <w:noProof/>
-          <w:sz w:val="20"/>
-          <w:szCs w:val="20"/>
-        </w:rPr>
-        <w:t>University of Ghana</w:t>
+        <w:t>medical degree at the Accra College of Medicine.</w:t>
+      </w:r>
+      <w:r>
+        <w:rPr>
+          <w:rFonts w:ascii="Times New Roman" w:hAnsi="Times New Roman" w:cs="Times New Roman"/>
+          <w:noProof/>
+          <w:sz w:val="20"/>
+          <w:szCs w:val="20"/>
+        </w:rPr>
+        <w:t xml:space="preserve"> She is a</w:t>
+      </w:r>
+      <w:r>
+        <w:rPr>
+          <w:rFonts w:ascii="Times New Roman" w:hAnsi="Times New Roman" w:cs="Times New Roman"/>
+          <w:noProof/>
+          <w:sz w:val="20"/>
+          <w:szCs w:val="20"/>
+        </w:rPr>
+        <w:t>n aspiring neurosurgeon with an interest in neuroscience research, specifically functional neurosurgery. She aims to contribute to research that improves current practice and treatment outcomes.</w:t>
+      </w:r>
+    </w:p>
+    <w:p>
+      <w:pPr>
+        <w:spacing w:after="0" w:line="276" w:lineRule="auto"/>
+        <w:ind w:right="-761"/>
+        <w:jc w:val="both"/>
+        <w:rPr>
+          <w:rFonts w:ascii="Times New Roman" w:hAnsi="Times New Roman" w:cs="Times New Roman"/>
+          <w:noProof/>
+          <w:sz w:val="20"/>
+          <w:szCs w:val="20"/>
+        </w:rPr>
+      </w:pPr>
+    </w:p>
+    <w:p>
+      <w:pPr>
+        <w:spacing w:after="0" w:line="276" w:lineRule="auto"/>
+        <w:ind w:right="-761"/>
+        <w:jc w:val="both"/>
+        <w:rPr>
+          <w:rFonts w:ascii="Times New Roman" w:hAnsi="Times New Roman" w:cs="Times New Roman"/>
+          <w:noProof/>
+          <w:sz w:val="20"/>
+          <w:szCs w:val="20"/>
+        </w:rPr>
+      </w:pPr>
+      <w:r>
+        <w:rPr>
+          <w:rFonts w:ascii="Times New Roman" w:hAnsi="Times New Roman" w:cs="Times New Roman"/>
+          <w:noProof/>
+          <w:sz w:val="20"/>
+          <w:szCs w:val="20"/>
+        </w:rPr>
+        <w:t>Krishi Patel – Research Co-Lead</w:t>
+      </w:r>
+    </w:p>
+    <w:p>
+      <w:pPr>
+        <w:spacing w:after="0" w:line="276" w:lineRule="auto"/>
+        <w:ind w:right="-761"/>
+        <w:jc w:val="both"/>
+        <w:rPr>
+          <w:rFonts w:ascii="Times New Roman" w:hAnsi="Times New Roman" w:cs="Times New Roman"/>
+          <w:noProof/>
+          <w:sz w:val="20"/>
+          <w:szCs w:val="20"/>
+        </w:rPr>
+      </w:pPr>
+      <w:r>
+        <w:rPr>
+          <w:rFonts w:ascii="Times New Roman" w:hAnsi="Times New Roman" w:cs="Times New Roman"/>
+          <w:noProof/>
+          <w:sz w:val="20"/>
+          <w:szCs w:val="20"/>
+        </w:rPr>
+        <w:t xml:space="preserve">Krishi </w:t>
+      </w:r>
+      <w:r>
+        <w:rPr>
+          <w:rFonts w:ascii="Times New Roman" w:hAnsi="Times New Roman" w:cs="Times New Roman"/>
+          <w:noProof/>
+          <w:sz w:val="20"/>
+          <w:szCs w:val="20"/>
+        </w:rPr>
+        <w:t>is a f</w:t>
+      </w:r>
+      <w:r>
+        <w:rPr>
+          <w:rFonts w:ascii="Times New Roman" w:hAnsi="Times New Roman" w:cs="Times New Roman"/>
+          <w:noProof/>
+          <w:sz w:val="20"/>
+          <w:szCs w:val="20"/>
+        </w:rPr>
+        <w:t>ourth</w:t>
+      </w:r>
+      <w:r>
+        <w:rPr>
+          <w:rFonts w:ascii="Times New Roman" w:hAnsi="Times New Roman" w:cs="Times New Roman"/>
+          <w:noProof/>
+          <w:sz w:val="20"/>
+          <w:szCs w:val="20"/>
+        </w:rPr>
+        <w:t>-year medical student at the University of Ghana</w:t>
       </w:r>
       <w:r>
         <w:rPr>
@@ -522,118 +936,16 @@
           <w:sz w:val="20"/>
           <w:szCs w:val="20"/>
         </w:rPr>
-        <w:t>S</w:t>
-      </w:r>
-      <w:r>
-        <w:rPr>
-          <w:rFonts w:ascii="Times New Roman" w:hAnsi="Times New Roman" w:cs="Times New Roman"/>
-          <w:noProof/>
-          <w:sz w:val="20"/>
-          <w:szCs w:val="20"/>
-        </w:rPr>
-        <w:t xml:space="preserve">he is an aspiring neurosurgeon </w:t>
-      </w:r>
-      <w:r>
-        <w:rPr>
-          <w:rFonts w:ascii="Times New Roman" w:hAnsi="Times New Roman" w:cs="Times New Roman"/>
-          <w:noProof/>
-          <w:sz w:val="20"/>
-          <w:szCs w:val="20"/>
-        </w:rPr>
-        <w:t xml:space="preserve">and is </w:t>
-      </w:r>
-      <w:r>
-        <w:rPr>
-          <w:rFonts w:ascii="Times New Roman" w:hAnsi="Times New Roman" w:cs="Times New Roman"/>
-          <w:noProof/>
-          <w:sz w:val="20"/>
-          <w:szCs w:val="20"/>
-        </w:rPr>
-        <w:t>passionate about research and all things neuroscience, and looks forward to a fulfilling career in academic medicine</w:t>
-      </w:r>
-      <w:r>
-        <w:rPr>
-          <w:rFonts w:ascii="Times New Roman" w:hAnsi="Times New Roman" w:cs="Times New Roman"/>
-          <w:noProof/>
-          <w:sz w:val="20"/>
-          <w:szCs w:val="20"/>
-        </w:rPr>
-        <w:t>.</w:t>
-      </w:r>
-    </w:p>
-    <w:p>
-      <w:pPr>
-        <w:spacing w:after="0" w:line="276" w:lineRule="auto"/>
-        <w:ind w:right="-761"/>
-        <w:jc w:val="both"/>
-        <w:rPr>
-          <w:rFonts w:ascii="Times New Roman" w:hAnsi="Times New Roman" w:cs="Times New Roman"/>
-          <w:noProof/>
-          <w:sz w:val="20"/>
-          <w:szCs w:val="20"/>
-        </w:rPr>
-      </w:pPr>
-    </w:p>
-    <w:p>
-      <w:pPr>
-        <w:spacing w:after="0" w:line="276" w:lineRule="auto"/>
-        <w:ind w:right="-761"/>
-        <w:jc w:val="both"/>
-        <w:rPr>
-          <w:rFonts w:ascii="Times New Roman" w:hAnsi="Times New Roman" w:cs="Times New Roman"/>
-          <w:noProof/>
-          <w:sz w:val="20"/>
-          <w:szCs w:val="20"/>
-        </w:rPr>
-      </w:pPr>
-      <w:r>
-        <w:rPr>
-          <w:rFonts w:ascii="Times New Roman" w:hAnsi="Times New Roman" w:cs="Times New Roman"/>
-          <w:noProof/>
-          <w:sz w:val="20"/>
-          <w:szCs w:val="20"/>
-        </w:rPr>
-        <w:t>Mildred Obeyaa Marfo – Education Lead</w:t>
-      </w:r>
-    </w:p>
-    <w:p>
-      <w:pPr>
-        <w:spacing w:after="0" w:line="276" w:lineRule="auto"/>
-        <w:ind w:right="-761"/>
-        <w:jc w:val="both"/>
-        <w:rPr>
-          <w:rFonts w:ascii="Times New Roman" w:hAnsi="Times New Roman" w:cs="Times New Roman"/>
-          <w:noProof/>
-          <w:sz w:val="20"/>
-          <w:szCs w:val="20"/>
-        </w:rPr>
-      </w:pPr>
-      <w:r>
-        <w:rPr>
-          <w:rFonts w:ascii="Times New Roman" w:hAnsi="Times New Roman" w:cs="Times New Roman"/>
-          <w:noProof/>
-          <w:sz w:val="20"/>
-          <w:szCs w:val="20"/>
-        </w:rPr>
-        <w:t>Mildred</w:t>
-      </w:r>
-      <w:r>
-        <w:rPr>
-          <w:rFonts w:ascii="Times New Roman" w:hAnsi="Times New Roman" w:cs="Times New Roman"/>
-          <w:noProof/>
-          <w:sz w:val="20"/>
-          <w:szCs w:val="20"/>
-        </w:rPr>
-        <w:t xml:space="preserve"> earned </w:t>
-      </w:r>
-      <w:r>
-        <w:rPr>
-          <w:rFonts w:ascii="Times New Roman" w:hAnsi="Times New Roman" w:cs="Times New Roman"/>
-          <w:noProof/>
-          <w:sz w:val="20"/>
-          <w:szCs w:val="20"/>
-        </w:rPr>
-        <w:t>her</w:t>
+        <w:t>Krishi is c</w:t>
+      </w:r>
+      <w:r>
+        <w:rPr>
+          <w:rFonts w:ascii="Times New Roman" w:hAnsi="Times New Roman" w:cs="Times New Roman"/>
+          <w:noProof/>
+          <w:sz w:val="20"/>
+          <w:szCs w:val="20"/>
+        </w:rPr>
+        <w:t>urious about how the brain shapes who we are</w:t>
       </w:r>
       <w:r>
         <w:rPr>
@@ -651,166 +963,82 @@
           <w:sz w:val="20"/>
           <w:szCs w:val="20"/>
         </w:rPr>
-        <w:t xml:space="preserve">medical degree at the University of Development Studies. Mildred is currently a houseofficer at the Achimota Hospital and is currently pursuing </w:t>
-      </w:r>
-    </w:p>
-    <w:p>
-      <w:pPr>
-        <w:spacing w:after="0" w:line="276" w:lineRule="auto"/>
-        <w:ind w:right="-761"/>
-        <w:jc w:val="both"/>
-        <w:rPr>
-          <w:rFonts w:ascii="Times New Roman" w:hAnsi="Times New Roman" w:cs="Times New Roman"/>
-          <w:noProof/>
-          <w:sz w:val="20"/>
-          <w:szCs w:val="20"/>
-        </w:rPr>
-      </w:pPr>
-    </w:p>
-    <w:p>
-      <w:pPr>
-        <w:spacing w:after="0" w:line="276" w:lineRule="auto"/>
-        <w:ind w:right="-761"/>
-        <w:jc w:val="both"/>
-        <w:rPr>
-          <w:rFonts w:ascii="Times New Roman" w:hAnsi="Times New Roman" w:cs="Times New Roman"/>
-          <w:noProof/>
-          <w:sz w:val="20"/>
-          <w:szCs w:val="20"/>
-        </w:rPr>
-      </w:pPr>
-      <w:r>
-        <w:rPr>
-          <w:rFonts w:ascii="Times New Roman" w:hAnsi="Times New Roman" w:cs="Times New Roman"/>
-          <w:noProof/>
-          <w:sz w:val="20"/>
-          <w:szCs w:val="20"/>
-        </w:rPr>
-        <w:t>Maame Doudua – Research Lead</w:t>
-      </w:r>
-    </w:p>
-    <w:p>
-      <w:pPr>
-        <w:spacing w:after="0" w:line="276" w:lineRule="auto"/>
-        <w:ind w:right="-761"/>
-        <w:jc w:val="both"/>
-        <w:rPr>
-          <w:rFonts w:ascii="Times New Roman" w:hAnsi="Times New Roman" w:cs="Times New Roman"/>
-          <w:noProof/>
-          <w:sz w:val="20"/>
-          <w:szCs w:val="20"/>
-        </w:rPr>
-      </w:pPr>
-      <w:r>
-        <w:rPr>
-          <w:rFonts w:ascii="Times New Roman" w:hAnsi="Times New Roman" w:cs="Times New Roman"/>
-          <w:noProof/>
-          <w:sz w:val="20"/>
-          <w:szCs w:val="20"/>
-        </w:rPr>
-        <w:t>Maame</w:t>
-      </w:r>
-      <w:r>
-        <w:rPr>
-          <w:rFonts w:ascii="Times New Roman" w:hAnsi="Times New Roman" w:cs="Times New Roman"/>
-          <w:noProof/>
-          <w:sz w:val="20"/>
-          <w:szCs w:val="20"/>
-        </w:rPr>
-        <w:t xml:space="preserve"> earned </w:t>
-      </w:r>
-      <w:r>
-        <w:rPr>
-          <w:rFonts w:ascii="Times New Roman" w:hAnsi="Times New Roman" w:cs="Times New Roman"/>
-          <w:noProof/>
-          <w:sz w:val="20"/>
-          <w:szCs w:val="20"/>
-        </w:rPr>
-        <w:t>her</w:t>
-      </w:r>
-      <w:r>
-        <w:rPr>
-          <w:rFonts w:ascii="Times New Roman" w:hAnsi="Times New Roman" w:cs="Times New Roman"/>
-          <w:noProof/>
-          <w:sz w:val="20"/>
-          <w:szCs w:val="20"/>
-        </w:rPr>
-        <w:t xml:space="preserve"> </w:t>
-      </w:r>
-      <w:r>
-        <w:rPr>
-          <w:rFonts w:ascii="Times New Roman" w:hAnsi="Times New Roman" w:cs="Times New Roman"/>
-          <w:noProof/>
-          <w:sz w:val="20"/>
-          <w:szCs w:val="20"/>
-        </w:rPr>
-        <w:t>medical degree at the Accra College of Medicine. Maame is currently a houseofficer at the Korle Bu Teaching Hospital and is pursuing a career in neurosurgery</w:t>
-      </w:r>
-      <w:r>
-        <w:rPr>
-          <w:rFonts w:ascii="Times New Roman" w:hAnsi="Times New Roman" w:cs="Times New Roman"/>
-          <w:noProof/>
-          <w:sz w:val="20"/>
-          <w:szCs w:val="20"/>
-        </w:rPr>
-        <w:t>.</w:t>
-      </w:r>
-    </w:p>
-    <w:p>
-      <w:pPr>
-        <w:spacing w:after="0" w:line="276" w:lineRule="auto"/>
-        <w:ind w:right="-761"/>
-        <w:jc w:val="both"/>
-        <w:rPr>
-          <w:rFonts w:ascii="Times New Roman" w:hAnsi="Times New Roman" w:cs="Times New Roman"/>
-          <w:noProof/>
-          <w:sz w:val="20"/>
-          <w:szCs w:val="20"/>
-        </w:rPr>
-      </w:pPr>
-    </w:p>
-    <w:p>
-      <w:pPr>
-        <w:spacing w:after="0" w:line="276" w:lineRule="auto"/>
-        <w:ind w:right="-761"/>
-        <w:jc w:val="both"/>
-        <w:rPr>
-          <w:rFonts w:ascii="Times New Roman" w:hAnsi="Times New Roman" w:cs="Times New Roman"/>
-          <w:noProof/>
-          <w:sz w:val="20"/>
-          <w:szCs w:val="20"/>
-        </w:rPr>
-      </w:pPr>
-      <w:r>
-        <w:rPr>
-          <w:rFonts w:ascii="Times New Roman" w:hAnsi="Times New Roman" w:cs="Times New Roman"/>
-          <w:noProof/>
-          <w:sz w:val="20"/>
-          <w:szCs w:val="20"/>
-        </w:rPr>
-        <w:t>Krishi Patel – Research Co-Lead</w:t>
-      </w:r>
-    </w:p>
-    <w:p>
-      <w:pPr>
-        <w:spacing w:after="0" w:line="276" w:lineRule="auto"/>
-        <w:ind w:right="-761"/>
-        <w:jc w:val="both"/>
-        <w:rPr>
-          <w:rFonts w:ascii="Times New Roman" w:hAnsi="Times New Roman" w:cs="Times New Roman"/>
-          <w:noProof/>
-          <w:sz w:val="20"/>
-          <w:szCs w:val="20"/>
-        </w:rPr>
-      </w:pPr>
-      <w:r>
-        <w:rPr>
-          <w:rFonts w:ascii="Times New Roman" w:hAnsi="Times New Roman" w:cs="Times New Roman"/>
-          <w:noProof/>
-          <w:sz w:val="20"/>
-          <w:szCs w:val="20"/>
-        </w:rPr>
-        <w:t xml:space="preserve">Krishi </w:t>
+        <w:t>and how disease can alter that</w:t>
+      </w:r>
+      <w:r>
+        <w:rPr>
+          <w:rFonts w:ascii="Times New Roman" w:hAnsi="Times New Roman" w:cs="Times New Roman"/>
+          <w:noProof/>
+          <w:sz w:val="20"/>
+          <w:szCs w:val="20"/>
+        </w:rPr>
+        <w:t>. She is also</w:t>
+      </w:r>
+      <w:r>
+        <w:rPr>
+          <w:rFonts w:ascii="Times New Roman" w:hAnsi="Times New Roman" w:cs="Times New Roman"/>
+          <w:noProof/>
+          <w:sz w:val="20"/>
+          <w:szCs w:val="20"/>
+        </w:rPr>
+        <w:t xml:space="preserve"> drawn to the intersection of neurology, psychology, and neuropsychology.</w:t>
+      </w:r>
+    </w:p>
+    <w:p>
+      <w:pPr>
+        <w:spacing w:after="0" w:line="276" w:lineRule="auto"/>
+        <w:ind w:right="-761"/>
+        <w:jc w:val="both"/>
+        <w:rPr>
+          <w:rFonts w:ascii="Times New Roman" w:hAnsi="Times New Roman" w:cs="Times New Roman"/>
+          <w:noProof/>
+          <w:sz w:val="20"/>
+          <w:szCs w:val="20"/>
+        </w:rPr>
+      </w:pPr>
+    </w:p>
+    <w:p>
+      <w:pPr>
+        <w:spacing w:after="0" w:line="276" w:lineRule="auto"/>
+        <w:ind w:right="-761"/>
+        <w:jc w:val="both"/>
+        <w:rPr>
+          <w:rFonts w:ascii="Times New Roman" w:hAnsi="Times New Roman" w:cs="Times New Roman"/>
+          <w:noProof/>
+          <w:sz w:val="20"/>
+          <w:szCs w:val="20"/>
+        </w:rPr>
+      </w:pPr>
+      <w:r>
+        <w:rPr>
+          <w:rFonts w:ascii="Times New Roman" w:hAnsi="Times New Roman" w:cs="Times New Roman"/>
+          <w:noProof/>
+          <w:sz w:val="20"/>
+          <w:szCs w:val="20"/>
+        </w:rPr>
+        <w:t>Kwaku Marfo – Research Co-Lead</w:t>
+      </w:r>
+    </w:p>
+    <w:p>
+      <w:pPr>
+        <w:spacing w:after="0" w:line="276" w:lineRule="auto"/>
+        <w:ind w:right="-761"/>
+        <w:jc w:val="both"/>
+        <w:rPr>
+          <w:rFonts w:ascii="Times New Roman" w:hAnsi="Times New Roman" w:cs="Times New Roman"/>
+          <w:noProof/>
+          <w:sz w:val="20"/>
+          <w:szCs w:val="20"/>
+        </w:rPr>
+      </w:pPr>
+      <w:r>
+        <w:rPr>
+          <w:rFonts w:ascii="Times New Roman" w:hAnsi="Times New Roman" w:cs="Times New Roman"/>
+          <w:noProof/>
+          <w:sz w:val="20"/>
+          <w:szCs w:val="20"/>
+        </w:rPr>
+        <w:t xml:space="preserve">Kwaku </w:t>
       </w:r>
       <w:r>
         <w:rPr>
@@ -864,118 +1092,52 @@
           <w:sz w:val="20"/>
           <w:szCs w:val="20"/>
         </w:rPr>
-        <w:t>She aims to pursue a career in neurosurgery, with a strong enthusiasm for neuroscience and research, and is committed to developing a meaningful path in academic medicine.</w:t>
-      </w:r>
-    </w:p>
-    <w:p>
-      <w:pPr>
-        <w:spacing w:after="0" w:line="276" w:lineRule="auto"/>
-        <w:ind w:right="-761"/>
-        <w:jc w:val="both"/>
-        <w:rPr>
-          <w:rFonts w:ascii="Times New Roman" w:hAnsi="Times New Roman" w:cs="Times New Roman"/>
-          <w:noProof/>
-          <w:sz w:val="20"/>
-          <w:szCs w:val="20"/>
-        </w:rPr>
-      </w:pPr>
-    </w:p>
-    <w:p>
-      <w:pPr>
-        <w:spacing w:after="0" w:line="276" w:lineRule="auto"/>
-        <w:ind w:right="-761"/>
-        <w:jc w:val="both"/>
-        <w:rPr>
-          <w:rFonts w:ascii="Times New Roman" w:hAnsi="Times New Roman" w:cs="Times New Roman"/>
-          <w:noProof/>
-          <w:sz w:val="20"/>
-          <w:szCs w:val="20"/>
-        </w:rPr>
-      </w:pPr>
-      <w:r>
-        <w:rPr>
-          <w:rFonts w:ascii="Times New Roman" w:hAnsi="Times New Roman" w:cs="Times New Roman"/>
-          <w:noProof/>
-          <w:sz w:val="20"/>
-          <w:szCs w:val="20"/>
-        </w:rPr>
-        <w:t>Kwaku Marfo – Research Co-Lead</w:t>
-      </w:r>
-    </w:p>
-    <w:p>
-      <w:pPr>
-        <w:spacing w:after="0" w:line="276" w:lineRule="auto"/>
-        <w:ind w:right="-761"/>
-        <w:jc w:val="both"/>
-        <w:rPr>
-          <w:rFonts w:ascii="Times New Roman" w:hAnsi="Times New Roman" w:cs="Times New Roman"/>
-          <w:noProof/>
-          <w:sz w:val="20"/>
-          <w:szCs w:val="20"/>
-        </w:rPr>
-      </w:pPr>
-      <w:r>
-        <w:rPr>
-          <w:rFonts w:ascii="Times New Roman" w:hAnsi="Times New Roman" w:cs="Times New Roman"/>
-          <w:noProof/>
-          <w:sz w:val="20"/>
-          <w:szCs w:val="20"/>
-        </w:rPr>
-        <w:t xml:space="preserve">Kwaku </w:t>
-      </w:r>
-      <w:r>
-        <w:rPr>
-          <w:rFonts w:ascii="Times New Roman" w:hAnsi="Times New Roman" w:cs="Times New Roman"/>
-          <w:noProof/>
-          <w:sz w:val="20"/>
-          <w:szCs w:val="20"/>
-        </w:rPr>
-        <w:t>is a f</w:t>
-      </w:r>
-      <w:r>
-        <w:rPr>
-          <w:rFonts w:ascii="Times New Roman" w:hAnsi="Times New Roman" w:cs="Times New Roman"/>
-          <w:noProof/>
-          <w:sz w:val="20"/>
-          <w:szCs w:val="20"/>
-        </w:rPr>
-        <w:t>ourth</w:t>
-      </w:r>
-      <w:r>
-        <w:rPr>
-          <w:rFonts w:ascii="Times New Roman" w:hAnsi="Times New Roman" w:cs="Times New Roman"/>
-          <w:noProof/>
-          <w:sz w:val="20"/>
-          <w:szCs w:val="20"/>
-        </w:rPr>
-        <w:t>-year medical student at the University of Ghana</w:t>
-      </w:r>
-      <w:r>
-        <w:rPr>
-          <w:rFonts w:ascii="Times New Roman" w:hAnsi="Times New Roman" w:cs="Times New Roman"/>
-          <w:noProof/>
-          <w:sz w:val="20"/>
-          <w:szCs w:val="20"/>
-        </w:rPr>
-        <w:t xml:space="preserve"> Medical School</w:t>
-      </w:r>
-      <w:r>
-        <w:rPr>
-          <w:rFonts w:ascii="Times New Roman" w:hAnsi="Times New Roman" w:cs="Times New Roman"/>
-          <w:noProof/>
-          <w:sz w:val="20"/>
-          <w:szCs w:val="20"/>
-        </w:rPr>
-        <w:t xml:space="preserve">. </w:t>
-      </w:r>
-      <w:r>
-        <w:rPr>
-          <w:rFonts w:ascii="Times New Roman" w:hAnsi="Times New Roman" w:cs="Times New Roman"/>
-          <w:noProof/>
-          <w:sz w:val="20"/>
-          <w:szCs w:val="20"/>
-        </w:rPr>
-        <w:t>She aims to pursue a career in neurosurgery, with a strong enthusiasm for neuroscience and research, and is committed to developing a meaningful path in academic medicine</w:t>
+        <w:t>He has</w:t>
+      </w:r>
+      <w:r>
+        <w:rPr>
+          <w:rFonts w:ascii="Times New Roman" w:hAnsi="Times New Roman" w:cs="Times New Roman"/>
+          <w:noProof/>
+          <w:sz w:val="20"/>
+          <w:szCs w:val="20"/>
+        </w:rPr>
+        <w:t xml:space="preserve"> a keen interest in neuroscience and its many disciplines. His </w:t>
+      </w:r>
+      <w:r>
+        <w:rPr>
+          <w:rFonts w:ascii="Times New Roman" w:hAnsi="Times New Roman" w:cs="Times New Roman"/>
+          <w:noProof/>
+          <w:sz w:val="20"/>
+          <w:szCs w:val="20"/>
+        </w:rPr>
+        <w:t>goals are</w:t>
+      </w:r>
+      <w:r>
+        <w:rPr>
+          <w:rFonts w:ascii="Times New Roman" w:hAnsi="Times New Roman" w:cs="Times New Roman"/>
+          <w:noProof/>
+          <w:sz w:val="20"/>
+          <w:szCs w:val="20"/>
+        </w:rPr>
+        <w:t xml:space="preserve"> to </w:t>
+      </w:r>
+      <w:r>
+        <w:rPr>
+          <w:rFonts w:ascii="Times New Roman" w:hAnsi="Times New Roman" w:cs="Times New Roman"/>
+          <w:noProof/>
+          <w:sz w:val="20"/>
+          <w:szCs w:val="20"/>
+        </w:rPr>
+        <w:t xml:space="preserve">one day </w:t>
+      </w:r>
+      <w:r>
+        <w:rPr>
+          <w:rFonts w:ascii="Times New Roman" w:hAnsi="Times New Roman" w:cs="Times New Roman"/>
+          <w:noProof/>
+          <w:sz w:val="20"/>
+          <w:szCs w:val="20"/>
+        </w:rPr>
+        <w:t>advance neurosurgical and neurological techniques and to simplify complex concepts, making them more accessible and less abstruse</w:t>
       </w:r>
       <w:r>
         <w:rPr>
@@ -1118,7 +1280,17 @@
           <w:sz w:val="20"/>
           <w:szCs w:val="20"/>
         </w:rPr>
-        <w:t xml:space="preserve"> at Korle-Bu Teaching Hospital, where she also lectures part-time at the University of Ghana Medical School. Her practice focuses on minimally invasive and keyhole neurosurgery, as well as interventional pain management, with additional interests in neuro-oncology, pediatric neurosurgery, and neuroendoscopy.</w:t>
+        <w:t xml:space="preserve"> at Korle-Bu Teaching Hospital, where she also lectures part-time at the University of Ghana Medical School. Her practice focuses on minimally invasive and keyhole neurosurgery, as well as interventional pain management, with additional interests in neuro-oncology, pediatric neurosurgery, and </w:t>
+      </w:r>
+      <w:r>
+        <w:rPr>
+          <w:rFonts w:ascii="Times New Roman" w:hAnsi="Times New Roman" w:cs="Times New Roman"/>
+          <w:noProof/>
+          <w:sz w:val="20"/>
+          <w:szCs w:val="20"/>
+        </w:rPr>
+        <w:lastRenderedPageBreak/>
+        <w:t>neuroendoscopy.</w:t>
       </w:r>
       <w:r>
         <w:rPr>
@@ -1202,17 +1374,7 @@
           <w:sz w:val="20"/>
           <w:szCs w:val="20"/>
         </w:rPr>
-        <w:t xml:space="preserve">Bankah, earned his medical degree from the University of Ghana and completed neurosurgical residency at Korle-Bu Teaching Hospital in Accra. He subsequently undertook fellowship training in pediatric neurosurgery at Johns Hopkins </w:t>
-      </w:r>
-      <w:r>
-        <w:rPr>
-          <w:rFonts w:ascii="Times New Roman" w:hAnsi="Times New Roman" w:cs="Times New Roman"/>
-          <w:noProof/>
-          <w:sz w:val="20"/>
-          <w:szCs w:val="20"/>
-        </w:rPr>
-        <w:lastRenderedPageBreak/>
-        <w:t>Hospital and now practices as a consultant neurosurgeon at Korle-Bu.</w:t>
+        <w:t>Bankah, earned his medical degree from the University of Ghana and completed neurosurgical residency at Korle-Bu Teaching Hospital in Accra. He subsequently undertook fellowship training in pediatric neurosurgery at Johns Hopkins Hospital and now practices as a consultant neurosurgeon at Korle-Bu.</w:t>
       </w:r>
       <w:r>
         <w:rPr>
@@ -1299,16 +1461,7 @@
           <w:sz w:val="20"/>
           <w:szCs w:val="20"/>
         </w:rPr>
-        <w:t xml:space="preserve">Dr. </w:t>
-      </w:r>
-      <w:r>
-        <w:rPr>
-          <w:rFonts w:ascii="Times New Roman" w:hAnsi="Times New Roman" w:cs="Times New Roman"/>
-          <w:noProof/>
-          <w:sz w:val="20"/>
-          <w:szCs w:val="20"/>
-        </w:rPr>
-        <w:t>Abdullah</w:t>
+        <w:t>Dr. Abdullah</w:t>
       </w:r>
     </w:p>
     <w:p>

</xml_diff>

<commit_message>
Tighten mobile layout and update bios
</commit_message>
<xml_diff>
--- a/Team Bios.docx
+++ b/Team Bios.docx
@@ -216,7 +216,43 @@
           <w:sz w:val="20"/>
           <w:szCs w:val="20"/>
         </w:rPr>
-        <w:t>Lois is a fifth-year medical student at the University of Ghana Medical School and Co-Chair of the Ghana Neuroscience Network, where she coordinates neuroscience research initiatives and collaborates with multidisciplinary teams. She has a strong interest in neurosurgery and is actively involved in research and academic activities within the field.</w:t>
+        <w:t>Lois is a fifth-year medical student at the University of Ghana Medical School and Co-Chair of the Ghana Neuroscience Network</w:t>
+      </w:r>
+      <w:r>
+        <w:rPr>
+          <w:rFonts w:ascii="Times New Roman" w:hAnsi="Times New Roman" w:cs="Times New Roman"/>
+          <w:noProof/>
+          <w:sz w:val="20"/>
+          <w:szCs w:val="20"/>
+        </w:rPr>
+        <w:t>.</w:t>
+      </w:r>
+      <w:r>
+        <w:rPr>
+          <w:rFonts w:ascii="Times New Roman" w:hAnsi="Times New Roman" w:cs="Times New Roman"/>
+          <w:noProof/>
+          <w:sz w:val="20"/>
+          <w:szCs w:val="20"/>
+        </w:rPr>
+        <w:t xml:space="preserve"> </w:t>
+      </w:r>
+      <w:r>
+        <w:rPr>
+          <w:rFonts w:ascii="Times New Roman" w:hAnsi="Times New Roman" w:cs="Times New Roman"/>
+          <w:noProof/>
+          <w:sz w:val="20"/>
+          <w:szCs w:val="20"/>
+        </w:rPr>
+        <w:t>S</w:t>
+      </w:r>
+      <w:r>
+        <w:rPr>
+          <w:rFonts w:ascii="Times New Roman" w:hAnsi="Times New Roman" w:cs="Times New Roman"/>
+          <w:noProof/>
+          <w:sz w:val="20"/>
+          <w:szCs w:val="20"/>
+        </w:rPr>
+        <w:t>he coordinates neuroscience research initiatives and collaborates with multidisciplinary teams. She has a strong interest in neurosurgery and is actively involved in research and academic activities within the field.</w:t>
       </w:r>
     </w:p>
     <w:p>

</xml_diff>